<commit_message>
Lab 1-2 report: add Done by / Checked by
</commit_message>
<xml_diff>
--- a/lab2/Lab12_OS_Macari_Chiril.docx
+++ b/lab2/Lab12_OS_Macari_Chiril.docx
@@ -274,7 +274,6 @@
           <w:szCs w:val="32"/>
           <w:lang w:val="en-GB" w:bidi="th-TH"/>
         </w:rPr>
-        <w:t>Macari Chiril-Adam, FAF-243</w:t>
       </w:r>
     </w:p>
     <w:p>
@@ -598,7 +597,7 @@
     </w:p>
     <w:p>
       <w:pPr>
-        <w:jc w:val="center"/>
+        <w:jc w:val="right"/>
         <w:rPr>
           <w:b/>
           <w:bCs/>
@@ -607,6 +606,19 @@
           <w:lang w:val="en-GB" w:bidi="th-TH"/>
         </w:rPr>
       </w:pPr>
+      <w:r>
+        <w:rPr>
+          <w:b/>
+          <w:sz w:val="28"/>
+        </w:rPr>
+        <w:t xml:space="preserve">Done by: </w:t>
+      </w:r>
+      <w:r>
+        <w:rPr>
+          <w:sz w:val="28"/>
+        </w:rPr>
+        <w:t>st. gr. FAF-243, Chiril-Adam Macari</w:t>
+      </w:r>
     </w:p>
     <w:p>
       <w:pPr>
@@ -622,7 +634,7 @@
     </w:p>
     <w:p>
       <w:pPr>
-        <w:jc w:val="center"/>
+        <w:jc w:val="right"/>
         <w:rPr>
           <w:b/>
           <w:bCs/>
@@ -631,6 +643,19 @@
           <w:lang w:val="en-GB" w:bidi="th-TH"/>
         </w:rPr>
       </w:pPr>
+      <w:r>
+        <w:rPr>
+          <w:b/>
+          <w:sz w:val="28"/>
+        </w:rPr>
+        <w:t xml:space="preserve">Checked by: </w:t>
+      </w:r>
+      <w:r>
+        <w:rPr>
+          <w:sz w:val="28"/>
+        </w:rPr>
+        <w:t>Reițman Patricia, asist. univ.</w:t>
+      </w:r>
     </w:p>
     <w:p>
       <w:pPr>

</xml_diff>